<commit_message>
Regenerate final backtest report and strategy doc for 1005 rules; fix declaration text and agent test
Co-Authored-By: Claude Sonnet 5.5 <noreply@anthropic.com>
Claude-Session: https://claude.ai/code/session_01BubJYpgW8Vu5uQA7s6UVSQ
</commit_message>
<xml_diff>
--- a/output/strategy_doc.docx
+++ b/output/strategy_doc.docx
@@ -227,7 +227,7 @@
                 <w:rFonts w:ascii="標楷體" w:hAnsi="標楷體" w:eastAsia="標楷體"/>
                 <w:sz w:val="21"/>
               </w:rPr>
-              <w:t>本 ETF 以台股 150 檔投資範圍內市值最大的 28 檔為市值加權核心（2330 ≤ 20%、個股 ≤ 8%），貼近大盤風險報酬並控管集中度；AI Agent 每日閱讀財報、法說會、月營收、投信連續買賣超與重大訊息，對個股做單檔 ±3%、總偏離 ≤ 15% 的小幅加減碼，每筆都須引用具名公開資訊，tilt 最短持有 5 個交易日，沒有證據就維持基準。同時與主動型 ETF 前十大持股保持 Active Share ≥ 27%，追求低回檔與紀律化的超額報酬。</w:t>
+              <w:t>本 ETF 以台股 150 檔投資範圍內市值最大的 28 檔為市值加權核心（2330 ≤ 20%、個股 ≤ 8%），貼近大盤風險報酬並控管集中度；AI Agent 每日閱讀財報、法說會、月營收、投信連續買賣超與重大訊息，對個股做單檔 ±3%、總偏離 ≤ 15% 的小幅加減碼，每筆都須引用具名公開資訊，tilt 最短持有 5 個交易日，沒有證據就維持基準。同時與主動型 ETF 前十大持股保持 Active Share ≥ 22%，追求低回檔與紀律化的超額報酬。</w:t>
             </w:r>
           </w:p>
         </w:tc>
@@ -295,7 +295,7 @@
           <w:i w:val="0"/>
           <w:sz w:val="20"/>
         </w:rPr>
-        <w:t>投資範圍內『有當日價格且 20 日均成交值 ≥ 2 億』的股票，以市值（還原收盤價 × 發行股數）加權，2330 權重上限 20%、其他個股上限 8%（超額按市值比例重分配）；取權重最大的前 28 檔重新歸一；現金 3%；再以最小調整法（只動 1–3 檔重疊最大的標的，減下的權重分給第 11–28 名）把 Active Share 補到 ≥ 27%。</w:t>
+        <w:t>投資範圍內『有當日價格且 20 日均成交值 ≥ 2 億』的股票，以市值（還原收盤價 × 發行股數）加權，2330 權重上限 20%、其他個股上限 8%（超額按市值比例重分配）；取權重最大的前 28 檔重新歸一；現金 3%；再以最小調整法（只動 1–3 檔重疊最大的標的，減下的權重分給第 16–28 名）把 Active Share 補到 ≥ 22%（官方門檻 15%，前 15 大口徑）。</w:t>
       </w:r>
     </w:p>
     <w:tbl>
@@ -502,7 +502,7 @@
                 <w:rFonts w:ascii="微軟正黑體" w:hAnsi="微軟正黑體" w:eastAsia="微軟正黑體"/>
                 <w:sz w:val="18"/>
               </w:rPr>
-              <w:t>與任一主動型 ETF 前 10 大持股的 Active Share 目標 ≥ 27%（官方門檻 20%）。基準權重不足時，先用最小調整法（只動 1–3 檔重疊最大的標的，減下的權重分給第 11–28 名），不夠再逐步放寬</w:t>
+              <w:t>我方前 15 大持股與任一主動型 ETF 前 15 大持股的 Active Share 目標 ≥ 22%（官方門檻 15%，低於且連續 2 日取消資格）。基準權重不足時，先用最小調整法（只動 1–3 檔重疊最大的標的，減下的權重分給第 16–28 名），不夠再逐步放寬</w:t>
             </w:r>
           </w:p>
         </w:tc>
@@ -534,7 +534,7 @@
                 <w:rFonts w:ascii="微軟正黑體" w:hAnsi="微軟正黑體" w:eastAsia="微軟正黑體"/>
                 <w:sz w:val="18"/>
               </w:rPr>
-              <w:t>前日收盤 Active Share &lt; 22% → 當日必須再平衡到 ≥ 27%，不受無交易帶與 5 日週期限制；前日收盤已經 &lt; 20% → 當日補到 ≥ 34%，避免連續 2 日低於官方門檻</w:t>
+              <w:t>前日收盤 Active Share &lt; 17% → 當日必須再平衡到 ≥ 22%，不受無交易帶與 5 日週期限制；前日收盤已經 &lt; 15% → 當日補到 ≥ 29%，避免連續 2 日低於官方門檻</w:t>
             </w:r>
           </w:p>
         </w:tc>
@@ -657,7 +657,7 @@
                 <w:rFonts w:ascii="微軟正黑體" w:hAnsi="微軟正黑體" w:eastAsia="微軟正黑體"/>
                 <w:sz w:val="18"/>
               </w:rPr>
-              <w:t>• inferences：再平衡日以「依合規基準（市值加權、2330 ≤ 20%、個股 ≤ 8%、取前 28 檔、Active Share ≥ 27%）重新計算目標權重，偏離無交易帶者才調整」為推論；非再平衡日或差距在無交易帶內者，以「基準權重未偏離無交易帶」為推論，並寫入 no_trade_decisions。</w:t>
+              <w:t>• inferences：再平衡日以「依合規基準（市值加權、2330 ≤ 20%、個股 ≤ 8%、取前 28 檔、Active Share ≥ 22%）重新計算目標權重，偏離無交易帶者才調整」為推論；非再平衡日或差距在無交易帶內者，以「基準權重未偏離無交易帶」為推論，並寫入 no_trade_decisions。</w:t>
             </w:r>
           </w:p>
           <w:p>
@@ -1822,7 +1822,7 @@
                 <w:rFonts w:ascii="微軟正黑體" w:hAnsi="微軟正黑體" w:eastAsia="微軟正黑體"/>
                 <w:sz w:val="18"/>
               </w:rPr>
-              <w:t>+21.0%</w:t>
+              <w:t>+19.5%</w:t>
             </w:r>
           </w:p>
         </w:tc>
@@ -1837,7 +1837,7 @@
                 <w:rFonts w:ascii="微軟正黑體" w:hAnsi="微軟正黑體" w:eastAsia="微軟正黑體"/>
                 <w:sz w:val="18"/>
               </w:rPr>
-              <w:t>-5.0%</w:t>
+              <w:t>-4.7%</w:t>
             </w:r>
           </w:p>
         </w:tc>
@@ -1852,7 +1852,7 @@
                 <w:rFonts w:ascii="微軟正黑體" w:hAnsi="微軟正黑體" w:eastAsia="微軟正黑體"/>
                 <w:sz w:val="18"/>
               </w:rPr>
-              <w:t>21.8%</w:t>
+              <w:t>21.9%</w:t>
             </w:r>
           </w:p>
         </w:tc>
@@ -1867,7 +1867,7 @@
                 <w:rFonts w:ascii="微軟正黑體" w:hAnsi="微軟正黑體" w:eastAsia="微軟正黑體"/>
                 <w:sz w:val="18"/>
               </w:rPr>
-              <w:t>3.3x</w:t>
+              <w:t>1.3x</w:t>
             </w:r>
           </w:p>
         </w:tc>
@@ -1899,7 +1899,7 @@
                 <w:rFonts w:ascii="微軟正黑體" w:hAnsi="微軟正黑體" w:eastAsia="微軟正黑體"/>
                 <w:sz w:val="18"/>
               </w:rPr>
-              <w:t>+19.9%</w:t>
+              <w:t>+19.1%</w:t>
             </w:r>
           </w:p>
         </w:tc>
@@ -1914,7 +1914,7 @@
                 <w:rFonts w:ascii="微軟正黑體" w:hAnsi="微軟正黑體" w:eastAsia="微軟正黑體"/>
                 <w:sz w:val="18"/>
               </w:rPr>
-              <w:t>-4.9%</w:t>
+              <w:t>-4.8%</w:t>
             </w:r>
           </w:p>
         </w:tc>
@@ -1929,7 +1929,7 @@
                 <w:rFonts w:ascii="微軟正黑體" w:hAnsi="微軟正黑體" w:eastAsia="微軟正黑體"/>
                 <w:sz w:val="18"/>
               </w:rPr>
-              <w:t>17.2%（最低）</w:t>
+              <w:t>20.4%（最低）</w:t>
             </w:r>
           </w:p>
         </w:tc>
@@ -1944,7 +1944,7 @@
                 <w:rFonts w:ascii="微軟正黑體" w:hAnsi="微軟正黑體" w:eastAsia="微軟正黑體"/>
                 <w:sz w:val="18"/>
               </w:rPr>
-              <w:t>6.7x</w:t>
+              <w:t>4.3x</w:t>
             </w:r>
           </w:p>
         </w:tc>
@@ -1976,7 +1976,7 @@
                 <w:rFonts w:ascii="微軟正黑體" w:hAnsi="微軟正黑體" w:eastAsia="微軟正黑體"/>
                 <w:sz w:val="18"/>
               </w:rPr>
-              <w:t>+18.2% ～ +21.7%</w:t>
+              <w:t>+17.4% ～ +20.7%</w:t>
             </w:r>
           </w:p>
         </w:tc>
@@ -1991,7 +1991,7 @@
                 <w:rFonts w:ascii="微軟正黑體" w:hAnsi="微軟正黑體" w:eastAsia="微軟正黑體"/>
                 <w:sz w:val="18"/>
               </w:rPr>
-              <w:t>最差 -5.6%</w:t>
+              <w:t>最差 -5.4%</w:t>
             </w:r>
           </w:p>
         </w:tc>
@@ -2042,7 +2042,7 @@
           <w:rFonts w:ascii="微軟正黑體" w:hAnsi="微軟正黑體" w:eastAsia="微軟正黑體"/>
           <w:sz w:val="19"/>
         </w:rPr>
-        <w:t>• 隨機 tilt（每次 5 檔、±1～3%）沒有資訊含量，反映的是『Agent 判斷失誤的成本』：樣本外相對市值加權上限基準平均 -0.9%（5%～95%：-2.6% ～ +0.8%），最大回檔平均 -4.9%，與基準相近，損失有界。</w:t>
+        <w:t>• 隨機 tilt（每次 5 檔、±1～3%）沒有資訊含量，反映的是『Agent 判斷失誤的成本』：樣本外相對市值加權上限基準平均 -1.7%（5%～95%：-3.4% ～ -0.1%），最大回檔平均 -4.8%，與基準相近，損失有界。</w:t>
       </w:r>
     </w:p>
     <w:p>
@@ -2055,7 +2055,7 @@
           <w:rFonts w:ascii="微軟正黑體" w:hAnsi="微軟正黑體" w:eastAsia="微軟正黑體"/>
           <w:sz w:val="19"/>
         </w:rPr>
-        <w:t>• 框架檢查：100 次模擬、每日期末檢查，持股檔數違規 0、權重上限違規 0、現金比違規 0；Active Share 單日低於 20% 共 18 天、最長連續 1 日（官方取消資格條件為連續 2 日）。</w:t>
+        <w:t>• 框架檢查：100 次模擬、每日期末檢查，持股檔數違規 0、權重上限違規 0、現金比違規 0；Active Share 單日低於 15% 共 0 天、最長連續 0 日（官方取消資格條件為連續 2 日）。</w:t>
       </w:r>
     </w:p>
     <w:p>
@@ -2068,7 +2068,7 @@
           <w:rFonts w:ascii="微軟正黑體" w:hAnsi="微軟正黑體" w:eastAsia="微軟正黑體"/>
           <w:sz w:val="19"/>
         </w:rPr>
-        <w:t>• 壓力測試（tilt 每天都變，30 次）：樣本外平均 +17.8%，年換手 28x——tilt 頻繁變動的成本很高，因此規則要求最短持有 5 日、無新事件不變動。</w:t>
+        <w:t>• 壓力測試（tilt 每天都變，30 次）：樣本外平均 +17.8%，年換手 19x——tilt 頻繁變動的成本很高，因此規則要求最短持有 5 日、無新事件不變動。</w:t>
       </w:r>
     </w:p>
     <w:p>
@@ -2081,7 +2081,7 @@
           <w:rFonts w:ascii="微軟正黑體" w:hAnsi="微軟正黑體" w:eastAsia="微軟正黑體"/>
           <w:sz w:val="19"/>
         </w:rPr>
-        <w:t>• 回測不證明 Agent 能創造超額報酬：真實 Agent 的 tilt 有資訊含量與否，要靠初賽期間的實際表現檢驗。樣本外僅 44 個交易日，統計誤差大；Active Share 以 2026-10-06 的主動型 ETF 前 10 大持股快照近似；未計股利。</w:t>
+        <w:t>• 回測不證明 Agent 能創造超額報酬：真實 Agent 的 tilt 有資訊含量與否，要靠初賽期間的實際表現檢驗。樣本外僅 44 個交易日，統計誤差大；Active Share 以 2026-10-11 的主動型 ETF 前 15 大持股快照近似；未計股利與除權配股（官方期末才一次加回）。</w:t>
       </w:r>
     </w:p>
     <w:tbl>
@@ -2426,7 +2426,7 @@
                 <w:rFonts w:ascii="微軟正黑體" w:hAnsi="微軟正黑體" w:eastAsia="微軟正黑體"/>
                 <w:sz w:val="18"/>
               </w:rPr>
-              <w:t>Active Share ≥ 27%（官方 20%）</w:t>
+              <w:t>Active Share ≥ 22%（官方 15%）</w:t>
             </w:r>
           </w:p>
         </w:tc>

</xml_diff>